<commit_message>
Align CV with LinkedIn and add patents
</commit_message>
<xml_diff>
--- a/cv/files/cv.docx
+++ b/cv/files/cv.docx
@@ -2,7 +2,7 @@
 <file path=word/document.xml><?xml version="1.0" encoding="utf-8"?>
 <w:document xmlns:w="http://schemas.openxmlformats.org/wordprocessingml/2006/main" xmlns:m="http://schemas.openxmlformats.org/officeDocument/2006/math" xmlns:r="http://schemas.openxmlformats.org/officeDocument/2006/relationships" xmlns:o="urn:schemas-microsoft-com:office:office" xmlns:v="urn:schemas-microsoft-com:vml" xmlns:w10="urn:schemas-microsoft-com:office:word" xmlns:a="http://schemas.openxmlformats.org/drawingml/2006/main" xmlns:pic="http://schemas.openxmlformats.org/drawingml/2006/picture" xmlns:wp="http://schemas.openxmlformats.org/drawingml/2006/wordprocessingDrawing">
   <w:body>
-    <w:bookmarkStart w:id="33" w:name="guilherme-salazar"/>
+    <w:bookmarkStart w:id="34" w:name="guilherme-salazar"/>
     <w:p>
       <w:pPr>
         <w:pStyle w:val="Heading1"/>
@@ -16,7 +16,7 @@
         <w:pStyle w:val="FirstParagraph"/>
       </w:pPr>
       <w:r>
-        <w:t xml:space="preserve">Goiania, Goias, Brazil |</w:t>
+        <w:t xml:space="preserve">Goiânia, Goiás, Brazil |</w:t>
       </w:r>
       <w:r>
         <w:t xml:space="preserve"> </w:t>
@@ -73,7 +73,7 @@
           <w:iCs/>
           <w:i/>
         </w:rPr>
-        <w:t xml:space="preserve">Software engineer with 10+ years of experience building foundational API infrastructure. Staff Software Engineer at JetStream Security, working on AI governance for agentic systems. Previously spent nearly nine years at Kong shaping how traffic flows between services across Kong Gateway and Kong Enterprise, most recently building AI-agent tooling (Context Mesh).</w:t>
+        <w:t xml:space="preserve">Software engineer with 10+ years of experience building foundational API infrastructure. Staff Software Engineer at JetStream Security, building AI governance, observability, and security infrastructure for LLMs, MCP, and agents. Previously spent nearly nine years at Kong across Kong Gateway and Kong Enterprise, most recently building AI-agent tooling (Context Mesh).</w:t>
       </w:r>
     </w:p>
     <w:bookmarkStart w:id="27" w:name="experience"/>
@@ -103,17 +103,17 @@
         <w:pStyle w:val="Compact"/>
       </w:pPr>
       <w:r>
-        <w:t xml:space="preserve">Building infrastructure for governance, observability, and security of enterprise AI traffic.</w:t>
+        <w:t xml:space="preserve">Building infrastructure for governance, observability, and security of enterprise AI traffic across LLMs, MCP, and agents.</w:t>
       </w:r>
     </w:p>
     <w:bookmarkEnd w:id="23"/>
-    <w:bookmarkStart w:id="24" w:name="X1b2582f7edd4ecc22a91560e51f7b567e43c8ae"/>
+    <w:bookmarkStart w:id="24" w:name="X96f352b375551069ac7f381b6b3252c8f4b66f2"/>
     <w:p>
       <w:pPr>
         <w:pStyle w:val="Heading3"/>
       </w:pPr>
       <w:r>
-        <w:t xml:space="preserve">Sr. Software Engineer - Kong Inc. (Jul 2017-May 2026)</w:t>
+        <w:t xml:space="preserve">Senior Software Engineer - Kong Inc. (Jul 2017-May 2026)</w:t>
       </w:r>
     </w:p>
     <w:p>
@@ -381,13 +381,13 @@
       </w:r>
     </w:p>
     <w:bookmarkEnd w:id="28"/>
-    <w:bookmarkStart w:id="29" w:name="X13606d31470cb5e677513d0797bafe84b22f4cc"/>
+    <w:bookmarkStart w:id="29" w:name="X44c9a65bc2511a3599e02de851b97ef842a0b3c"/>
     <w:p>
       <w:pPr>
         <w:pStyle w:val="Heading3"/>
       </w:pPr>
       <w:r>
-        <w:t xml:space="preserve">B.Sc, Computer Science - Universidade Federal de Goias (2011-2016)</w:t>
+        <w:t xml:space="preserve">B.Sc, Computer Science - Universidade Federal de Goiás (2011-2016)</w:t>
       </w:r>
     </w:p>
     <w:p>
@@ -428,12 +428,66 @@
     </w:p>
     <w:bookmarkEnd w:id="29"/>
     <w:bookmarkEnd w:id="30"/>
-    <w:bookmarkStart w:id="31" w:name="technical"/>
+    <w:bookmarkStart w:id="31" w:name="patents"/>
     <w:p>
       <w:pPr>
         <w:pStyle w:val="Heading2"/>
       </w:pPr>
       <w:r>
+        <w:t xml:space="preserve">Patents</w:t>
+      </w:r>
+    </w:p>
+    <w:p>
+      <w:pPr>
+        <w:numPr>
+          <w:ilvl w:val="0"/>
+          <w:numId w:val="1007"/>
+        </w:numPr>
+        <w:pStyle w:val="Compact"/>
+      </w:pPr>
+      <w:r>
+        <w:rPr>
+          <w:bCs/>
+          <w:b/>
+        </w:rPr>
+        <w:t xml:space="preserve">Evaluation and validation of application programming interface requests and responses for microservices applications</w:t>
+      </w:r>
+      <w:r>
+        <w:t xml:space="preserve"> </w:t>
+      </w:r>
+      <w:r>
+        <w:t xml:space="preserve">- US 12,645,512, issued Jun 2, 2026</w:t>
+      </w:r>
+    </w:p>
+    <w:p>
+      <w:pPr>
+        <w:numPr>
+          <w:ilvl w:val="0"/>
+          <w:numId w:val="1007"/>
+        </w:numPr>
+        <w:pStyle w:val="Compact"/>
+      </w:pPr>
+      <w:r>
+        <w:rPr>
+          <w:bCs/>
+          <w:b/>
+        </w:rPr>
+        <w:t xml:space="preserve">Configuration hash comparison</w:t>
+      </w:r>
+      <w:r>
+        <w:t xml:space="preserve"> </w:t>
+      </w:r>
+      <w:r>
+        <w:t xml:space="preserve">- US 11,996,982, issued May 4, 2024</w:t>
+      </w:r>
+    </w:p>
+    <w:bookmarkEnd w:id="31"/>
+    <w:bookmarkStart w:id="32" w:name="technical"/>
+    <w:p>
+      <w:pPr>
+        <w:pStyle w:val="Heading2"/>
+      </w:pPr>
+      <w:r>
         <w:t xml:space="preserve">Technical</w:t>
       </w:r>
     </w:p>
@@ -441,7 +495,7 @@
       <w:pPr>
         <w:numPr>
           <w:ilvl w:val="0"/>
-          <w:numId w:val="1007"/>
+          <w:numId w:val="1008"/>
         </w:numPr>
         <w:pStyle w:val="Compact"/>
       </w:pPr>
@@ -463,7 +517,7 @@
       <w:pPr>
         <w:numPr>
           <w:ilvl w:val="0"/>
-          <w:numId w:val="1007"/>
+          <w:numId w:val="1008"/>
         </w:numPr>
         <w:pStyle w:val="Compact"/>
       </w:pPr>
@@ -485,7 +539,7 @@
       <w:pPr>
         <w:numPr>
           <w:ilvl w:val="0"/>
-          <w:numId w:val="1007"/>
+          <w:numId w:val="1008"/>
         </w:numPr>
         <w:pStyle w:val="Compact"/>
       </w:pPr>
@@ -507,7 +561,7 @@
       <w:pPr>
         <w:numPr>
           <w:ilvl w:val="0"/>
-          <w:numId w:val="1007"/>
+          <w:numId w:val="1008"/>
         </w:numPr>
         <w:pStyle w:val="Compact"/>
       </w:pPr>
@@ -529,7 +583,7 @@
       <w:pPr>
         <w:numPr>
           <w:ilvl w:val="0"/>
-          <w:numId w:val="1007"/>
+          <w:numId w:val="1008"/>
         </w:numPr>
         <w:pStyle w:val="Compact"/>
       </w:pPr>
@@ -551,7 +605,7 @@
       <w:pPr>
         <w:numPr>
           <w:ilvl w:val="0"/>
-          <w:numId w:val="1007"/>
+          <w:numId w:val="1008"/>
         </w:numPr>
         <w:pStyle w:val="Compact"/>
       </w:pPr>
@@ -569,8 +623,8 @@
         <w:t xml:space="preserve">Linux, NetBSD, FreeBSD</w:t>
       </w:r>
     </w:p>
-    <w:bookmarkEnd w:id="31"/>
-    <w:bookmarkStart w:id="32" w:name="associations"/>
+    <w:bookmarkEnd w:id="32"/>
+    <w:bookmarkStart w:id="33" w:name="associations"/>
     <w:p>
       <w:pPr>
         <w:pStyle w:val="Heading2"/>
@@ -583,16 +637,16 @@
       <w:pPr>
         <w:numPr>
           <w:ilvl w:val="0"/>
-          <w:numId w:val="1008"/>
-        </w:numPr>
-        <w:pStyle w:val="Compact"/>
-      </w:pPr>
-      <w:r>
-        <w:t xml:space="preserve">Professional Member, Association for Computing Machinery (since 2011)</w:t>
-      </w:r>
-    </w:p>
-    <w:bookmarkEnd w:id="32"/>
+          <w:numId w:val="1009"/>
+        </w:numPr>
+        <w:pStyle w:val="Compact"/>
+      </w:pPr>
+      <w:r>
+        <w:t xml:space="preserve">Professional Member, Association for Computing Machinery (since Dec 2011)</w:t>
+      </w:r>
+    </w:p>
     <w:bookmarkEnd w:id="33"/>
+    <w:bookmarkEnd w:id="34"/>
     <w:sectPr/>
   </w:body>
 </w:document>
@@ -800,6 +854,9 @@
     <w:abstractNumId w:val="991"/>
   </w:num>
   <w:num w:numId="1008">
+    <w:abstractNumId w:val="991"/>
+  </w:num>
+  <w:num w:numId="1009">
     <w:abstractNumId w:val="991"/>
   </w:num>
 </w:numbering>

</xml_diff>